<commit_message>
Update Week 1 homework document.
Co-authored-by: Cursor <cursoragent@cursor.com>
</commit_message>
<xml_diff>
--- a/Week 1/Homework/Homework for week 1.docx
+++ b/Week 1/Homework/Homework for week 1.docx
@@ -714,6 +714,72 @@
           <w:lang w:val="en-US"/>
         </w:rPr>
       </w:pPr>
+    </w:p>
+    <w:p>
+      <w:pPr>
+        <w:rPr>
+          <w:rFonts w:ascii="Times New Roman" w:hAnsi="Times New Roman" w:cs="Times New Roman"/>
+          <w:lang w:val="en-US"/>
+        </w:rPr>
+      </w:pPr>
+    </w:p>
+    <w:p>
+      <w:pPr>
+        <w:rPr>
+          <w:rFonts w:ascii="Times New Roman" w:hAnsi="Times New Roman" w:cs="Times New Roman"/>
+          <w:lang w:val="en-US"/>
+        </w:rPr>
+      </w:pPr>
+    </w:p>
+    <w:p>
+      <w:pPr>
+        <w:rPr>
+          <w:rFonts w:ascii="Times New Roman" w:hAnsi="Times New Roman" w:cs="Times New Roman" w:hint="eastAsia"/>
+          <w:lang w:val="en-US"/>
+        </w:rPr>
+      </w:pPr>
+      <w:r>
+        <w:rPr>
+          <w:rFonts w:ascii="Times New Roman" w:hAnsi="Times New Roman" w:cs="Times New Roman"/>
+          <w:lang w:val="en-US"/>
+        </w:rPr>
+        <w:lastRenderedPageBreak/>
+        <w:drawing>
+          <wp:inline distT="0" distB="0" distL="0" distR="0" wp14:anchorId="29B76386" wp14:editId="0EC1028B">
+            <wp:extent cx="5943600" cy="2998470"/>
+            <wp:effectExtent l="0" t="0" r="0" b="0"/>
+            <wp:docPr id="1327672505" name="Picture 1"/>
+            <wp:cNvGraphicFramePr>
+              <a:graphicFrameLocks xmlns:a="http://schemas.openxmlformats.org/drawingml/2006/main" noChangeAspect="1"/>
+            </wp:cNvGraphicFramePr>
+            <a:graphic xmlns:a="http://schemas.openxmlformats.org/drawingml/2006/main">
+              <a:graphicData uri="http://schemas.openxmlformats.org/drawingml/2006/picture">
+                <pic:pic xmlns:pic="http://schemas.openxmlformats.org/drawingml/2006/picture">
+                  <pic:nvPicPr>
+                    <pic:cNvPr id="1327672505" name=""/>
+                    <pic:cNvPicPr/>
+                  </pic:nvPicPr>
+                  <pic:blipFill>
+                    <a:blip r:embed="rId13"/>
+                    <a:stretch>
+                      <a:fillRect/>
+                    </a:stretch>
+                  </pic:blipFill>
+                  <pic:spPr>
+                    <a:xfrm>
+                      <a:off x="0" y="0"/>
+                      <a:ext cx="5943600" cy="2998470"/>
+                    </a:xfrm>
+                    <a:prstGeom prst="rect">
+                      <a:avLst/>
+                    </a:prstGeom>
+                  </pic:spPr>
+                </pic:pic>
+              </a:graphicData>
+            </a:graphic>
+          </wp:inline>
+        </w:drawing>
+      </w:r>
     </w:p>
     <w:p>
       <w:pPr>

</xml_diff>